<commit_message>
functions assignments are done
</commit_message>
<xml_diff>
--- a/MYSQL/assignment 02.docx
+++ b/MYSQL/assignment 02.docx
@@ -664,6 +664,9 @@
     </w:p>
     <w:p>
       <w:r>
+        <w:rPr>
+          <w:noProof/>
+        </w:rPr>
         <w:drawing>
           <wp:inline distT="0" distB="0" distL="0" distR="0" wp14:anchorId="0F0CE2B9" wp14:editId="2E4FE0A2">
             <wp:extent cx="5731510" cy="677545"/>
@@ -717,10 +720,13 @@
     </w:p>
     <w:p>
       <w:r>
+        <w:rPr>
+          <w:noProof/>
+        </w:rPr>
         <w:drawing>
           <wp:inline distT="0" distB="0" distL="0" distR="0" wp14:anchorId="764550F4" wp14:editId="3FA031EC">
-            <wp:extent cx="5731510" cy="3079115"/>
-            <wp:effectExtent l="0" t="0" r="2540" b="6985"/>
+            <wp:extent cx="5731510" cy="2529068"/>
+            <wp:effectExtent l="0" t="0" r="2540" b="5080"/>
             <wp:docPr id="14" name="Picture 14"/>
             <wp:cNvGraphicFramePr>
               <a:graphicFrameLocks xmlns:a="http://schemas.openxmlformats.org/drawingml/2006/main" noChangeAspect="1"/>
@@ -741,7 +747,7 @@
                   <pic:spPr>
                     <a:xfrm>
                       <a:off x="0" y="0"/>
-                      <a:ext cx="5731510" cy="3079115"/>
+                      <a:ext cx="5773111" cy="2547425"/>
                     </a:xfrm>
                     <a:prstGeom prst="rect">
                       <a:avLst/>
@@ -787,10 +793,13 @@
     </w:p>
     <w:p>
       <w:r>
+        <w:rPr>
+          <w:noProof/>
+        </w:rPr>
         <w:drawing>
           <wp:inline distT="0" distB="0" distL="0" distR="0" wp14:anchorId="1190D455" wp14:editId="5B3EEAF6">
-            <wp:extent cx="5731510" cy="1666875"/>
-            <wp:effectExtent l="0" t="0" r="2540" b="9525"/>
+            <wp:extent cx="5731510" cy="1383174"/>
+            <wp:effectExtent l="0" t="0" r="2540" b="7620"/>
             <wp:docPr id="15" name="Picture 15"/>
             <wp:cNvGraphicFramePr>
               <a:graphicFrameLocks xmlns:a="http://schemas.openxmlformats.org/drawingml/2006/main" noChangeAspect="1"/>
@@ -811,7 +820,7 @@
                   <pic:spPr>
                     <a:xfrm>
                       <a:off x="0" y="0"/>
-                      <a:ext cx="5731510" cy="1666875"/>
+                      <a:ext cx="5758082" cy="1389587"/>
                     </a:xfrm>
                     <a:prstGeom prst="rect">
                       <a:avLst/>
@@ -831,6 +840,9 @@
     </w:p>
     <w:p>
       <w:r>
+        <w:rPr>
+          <w:noProof/>
+        </w:rPr>
         <w:drawing>
           <wp:inline distT="0" distB="0" distL="0" distR="0" wp14:anchorId="48FCAC44" wp14:editId="4830BC5F">
             <wp:extent cx="5731510" cy="458470"/>
@@ -871,6 +883,384 @@
     <w:p>
       <w:r>
         <w:t>Q16) Create Books table again with constraints:</w:t>
+      </w:r>
+    </w:p>
+    <w:p>
+      <w:r>
+        <w:drawing>
+          <wp:inline distT="0" distB="0" distL="0" distR="0" wp14:anchorId="5756ABFF" wp14:editId="256D31AF">
+            <wp:extent cx="5729474" cy="2401747"/>
+            <wp:effectExtent l="0" t="0" r="5080" b="0"/>
+            <wp:docPr id="17" name="Picture 17"/>
+            <wp:cNvGraphicFramePr>
+              <a:graphicFrameLocks xmlns:a="http://schemas.openxmlformats.org/drawingml/2006/main" noChangeAspect="1"/>
+            </wp:cNvGraphicFramePr>
+            <a:graphic xmlns:a="http://schemas.openxmlformats.org/drawingml/2006/main">
+              <a:graphicData uri="http://schemas.openxmlformats.org/drawingml/2006/picture">
+                <pic:pic xmlns:pic="http://schemas.openxmlformats.org/drawingml/2006/picture">
+                  <pic:nvPicPr>
+                    <pic:cNvPr id="1" name=""/>
+                    <pic:cNvPicPr/>
+                  </pic:nvPicPr>
+                  <pic:blipFill>
+                    <a:blip r:embed="rId20"/>
+                    <a:stretch>
+                      <a:fillRect/>
+                    </a:stretch>
+                  </pic:blipFill>
+                  <pic:spPr>
+                    <a:xfrm>
+                      <a:off x="0" y="0"/>
+                      <a:ext cx="5759944" cy="2414520"/>
+                    </a:xfrm>
+                    <a:prstGeom prst="rect">
+                      <a:avLst/>
+                    </a:prstGeom>
+                  </pic:spPr>
+                </pic:pic>
+              </a:graphicData>
+            </a:graphic>
+          </wp:inline>
+        </w:drawing>
+      </w:r>
+    </w:p>
+    <w:p>
+      <w:r>
+        <w:lastRenderedPageBreak/>
+        <w:t>Q17) Insert the following data into Books table:</w:t>
+      </w:r>
+    </w:p>
+    <w:p>
+      <w:r>
+        <w:drawing>
+          <wp:inline distT="0" distB="0" distL="0" distR="0" wp14:anchorId="16883222" wp14:editId="3E9A6039">
+            <wp:extent cx="5731510" cy="2505919"/>
+            <wp:effectExtent l="0" t="0" r="2540" b="8890"/>
+            <wp:docPr id="18" name="Picture 18"/>
+            <wp:cNvGraphicFramePr>
+              <a:graphicFrameLocks xmlns:a="http://schemas.openxmlformats.org/drawingml/2006/main" noChangeAspect="1"/>
+            </wp:cNvGraphicFramePr>
+            <a:graphic xmlns:a="http://schemas.openxmlformats.org/drawingml/2006/main">
+              <a:graphicData uri="http://schemas.openxmlformats.org/drawingml/2006/picture">
+                <pic:pic xmlns:pic="http://schemas.openxmlformats.org/drawingml/2006/picture">
+                  <pic:nvPicPr>
+                    <pic:cNvPr id="1" name=""/>
+                    <pic:cNvPicPr/>
+                  </pic:nvPicPr>
+                  <pic:blipFill>
+                    <a:blip r:embed="rId21"/>
+                    <a:stretch>
+                      <a:fillRect/>
+                    </a:stretch>
+                  </pic:blipFill>
+                  <pic:spPr>
+                    <a:xfrm>
+                      <a:off x="0" y="0"/>
+                      <a:ext cx="5737624" cy="2508592"/>
+                    </a:xfrm>
+                    <a:prstGeom prst="rect">
+                      <a:avLst/>
+                    </a:prstGeom>
+                  </pic:spPr>
+                </pic:pic>
+              </a:graphicData>
+            </a:graphic>
+          </wp:inline>
+        </w:drawing>
+      </w:r>
+    </w:p>
+    <w:p>
+      <w:r>
+        <w:t>Q18) Insert at least 5 more records into Books table.</w:t>
+      </w:r>
+    </w:p>
+    <w:p>
+      <w:r>
+        <w:drawing>
+          <wp:inline distT="0" distB="0" distL="0" distR="0" wp14:anchorId="44E8365E" wp14:editId="15D08AC3">
+            <wp:extent cx="5730525" cy="2569580"/>
+            <wp:effectExtent l="0" t="0" r="3810" b="2540"/>
+            <wp:docPr id="19" name="Picture 19"/>
+            <wp:cNvGraphicFramePr>
+              <a:graphicFrameLocks xmlns:a="http://schemas.openxmlformats.org/drawingml/2006/main" noChangeAspect="1"/>
+            </wp:cNvGraphicFramePr>
+            <a:graphic xmlns:a="http://schemas.openxmlformats.org/drawingml/2006/main">
+              <a:graphicData uri="http://schemas.openxmlformats.org/drawingml/2006/picture">
+                <pic:pic xmlns:pic="http://schemas.openxmlformats.org/drawingml/2006/picture">
+                  <pic:nvPicPr>
+                    <pic:cNvPr id="1" name=""/>
+                    <pic:cNvPicPr/>
+                  </pic:nvPicPr>
+                  <pic:blipFill>
+                    <a:blip r:embed="rId22"/>
+                    <a:stretch>
+                      <a:fillRect/>
+                    </a:stretch>
+                  </pic:blipFill>
+                  <pic:spPr>
+                    <a:xfrm>
+                      <a:off x="0" y="0"/>
+                      <a:ext cx="5747927" cy="2577383"/>
+                    </a:xfrm>
+                    <a:prstGeom prst="rect">
+                      <a:avLst/>
+                    </a:prstGeom>
+                  </pic:spPr>
+                </pic:pic>
+              </a:graphicData>
+            </a:graphic>
+          </wp:inline>
+        </w:drawing>
+      </w:r>
+    </w:p>
+    <w:p>
+      <w:r>
+        <w:t>Q19) View all data from Member and Books tables using SELECT.</w:t>
+      </w:r>
+    </w:p>
+    <w:p>
+      <w:r>
+        <w:drawing>
+          <wp:inline distT="0" distB="0" distL="0" distR="0" wp14:anchorId="1CF6B7D3" wp14:editId="295BAF76">
+            <wp:extent cx="5731510" cy="2448046"/>
+            <wp:effectExtent l="0" t="0" r="2540" b="9525"/>
+            <wp:docPr id="20" name="Picture 20"/>
+            <wp:cNvGraphicFramePr>
+              <a:graphicFrameLocks xmlns:a="http://schemas.openxmlformats.org/drawingml/2006/main" noChangeAspect="1"/>
+            </wp:cNvGraphicFramePr>
+            <a:graphic xmlns:a="http://schemas.openxmlformats.org/drawingml/2006/main">
+              <a:graphicData uri="http://schemas.openxmlformats.org/drawingml/2006/picture">
+                <pic:pic xmlns:pic="http://schemas.openxmlformats.org/drawingml/2006/picture">
+                  <pic:nvPicPr>
+                    <pic:cNvPr id="1" name=""/>
+                    <pic:cNvPicPr/>
+                  </pic:nvPicPr>
+                  <pic:blipFill>
+                    <a:blip r:embed="rId23"/>
+                    <a:stretch>
+                      <a:fillRect/>
+                    </a:stretch>
+                  </pic:blipFill>
+                  <pic:spPr>
+                    <a:xfrm>
+                      <a:off x="0" y="0"/>
+                      <a:ext cx="5744196" cy="2453464"/>
+                    </a:xfrm>
+                    <a:prstGeom prst="rect">
+                      <a:avLst/>
+                    </a:prstGeom>
+                  </pic:spPr>
+                </pic:pic>
+              </a:graphicData>
+            </a:graphic>
+          </wp:inline>
+        </w:drawing>
+      </w:r>
+    </w:p>
+    <w:p>
+      <w:r>
+        <w:lastRenderedPageBreak/>
+        <w:t xml:space="preserve">Q20) Drop </w:t>
+      </w:r>
+      <w:proofErr w:type="spellStart"/>
+      <w:r>
+        <w:t>Lib_Issue</w:t>
+      </w:r>
+      <w:proofErr w:type="spellEnd"/>
+      <w:r>
+        <w:t xml:space="preserve"> table.</w:t>
+      </w:r>
+    </w:p>
+    <w:p>
+      <w:r>
+        <w:drawing>
+          <wp:inline distT="0" distB="0" distL="0" distR="0" wp14:anchorId="3A00089F" wp14:editId="2F7107DE">
+            <wp:extent cx="5731510" cy="457200"/>
+            <wp:effectExtent l="0" t="0" r="2540" b="0"/>
+            <wp:docPr id="21" name="Picture 21"/>
+            <wp:cNvGraphicFramePr>
+              <a:graphicFrameLocks xmlns:a="http://schemas.openxmlformats.org/drawingml/2006/main" noChangeAspect="1"/>
+            </wp:cNvGraphicFramePr>
+            <a:graphic xmlns:a="http://schemas.openxmlformats.org/drawingml/2006/main">
+              <a:graphicData uri="http://schemas.openxmlformats.org/drawingml/2006/picture">
+                <pic:pic xmlns:pic="http://schemas.openxmlformats.org/drawingml/2006/picture">
+                  <pic:nvPicPr>
+                    <pic:cNvPr id="1" name=""/>
+                    <pic:cNvPicPr/>
+                  </pic:nvPicPr>
+                  <pic:blipFill>
+                    <a:blip r:embed="rId24"/>
+                    <a:stretch>
+                      <a:fillRect/>
+                    </a:stretch>
+                  </pic:blipFill>
+                  <pic:spPr>
+                    <a:xfrm>
+                      <a:off x="0" y="0"/>
+                      <a:ext cx="5731510" cy="457200"/>
+                    </a:xfrm>
+                    <a:prstGeom prst="rect">
+                      <a:avLst/>
+                    </a:prstGeom>
+                  </pic:spPr>
+                </pic:pic>
+              </a:graphicData>
+            </a:graphic>
+          </wp:inline>
+        </w:drawing>
+      </w:r>
+    </w:p>
+    <w:p>
+      <w:r>
+        <w:t>Q21) Create Issue table again with constraints:</w:t>
+      </w:r>
+    </w:p>
+    <w:p>
+      <w:r>
+        <w:t xml:space="preserve">- </w:t>
+      </w:r>
+      <w:proofErr w:type="spellStart"/>
+      <w:r>
+        <w:t>Lib_Issue_Id</w:t>
+      </w:r>
+      <w:proofErr w:type="spellEnd"/>
+      <w:r>
+        <w:t xml:space="preserve"> PRIMARY KEY</w:t>
+      </w:r>
+    </w:p>
+    <w:p>
+      <w:r>
+        <w:t xml:space="preserve">- </w:t>
+      </w:r>
+      <w:proofErr w:type="spellStart"/>
+      <w:r>
+        <w:t>Book_No</w:t>
+      </w:r>
+      <w:proofErr w:type="spellEnd"/>
+      <w:r>
+        <w:t xml:space="preserve"> FOREIGN KEY REFERENCES </w:t>
+      </w:r>
+      <w:proofErr w:type="gramStart"/>
+      <w:r>
+        <w:t>Books(</w:t>
+      </w:r>
+      <w:proofErr w:type="spellStart"/>
+      <w:proofErr w:type="gramEnd"/>
+      <w:r>
+        <w:t>Book_No</w:t>
+      </w:r>
+      <w:proofErr w:type="spellEnd"/>
+      <w:r>
+        <w:t>)</w:t>
+      </w:r>
+    </w:p>
+    <w:p>
+      <w:r>
+        <w:t xml:space="preserve">- </w:t>
+      </w:r>
+      <w:proofErr w:type="spellStart"/>
+      <w:r>
+        <w:t>Member_Id</w:t>
+      </w:r>
+      <w:proofErr w:type="spellEnd"/>
+      <w:r>
+        <w:t xml:space="preserve"> FOREIGN KEY REFERENCES </w:t>
+      </w:r>
+      <w:proofErr w:type="gramStart"/>
+      <w:r>
+        <w:t>Member(</w:t>
+      </w:r>
+      <w:proofErr w:type="spellStart"/>
+      <w:proofErr w:type="gramEnd"/>
+      <w:r>
+        <w:t>Member_Id</w:t>
+      </w:r>
+      <w:proofErr w:type="spellEnd"/>
+      <w:r>
+        <w:t>)</w:t>
+      </w:r>
+    </w:p>
+    <w:p>
+      <w:r>
+        <w:drawing>
+          <wp:inline distT="0" distB="0" distL="0" distR="0" wp14:anchorId="5426C865" wp14:editId="3610E482">
+            <wp:extent cx="5731510" cy="3130952"/>
+            <wp:effectExtent l="0" t="0" r="2540" b="0"/>
+            <wp:docPr id="22" name="Picture 22"/>
+            <wp:cNvGraphicFramePr>
+              <a:graphicFrameLocks xmlns:a="http://schemas.openxmlformats.org/drawingml/2006/main" noChangeAspect="1"/>
+            </wp:cNvGraphicFramePr>
+            <a:graphic xmlns:a="http://schemas.openxmlformats.org/drawingml/2006/main">
+              <a:graphicData uri="http://schemas.openxmlformats.org/drawingml/2006/picture">
+                <pic:pic xmlns:pic="http://schemas.openxmlformats.org/drawingml/2006/picture">
+                  <pic:nvPicPr>
+                    <pic:cNvPr id="1" name=""/>
+                    <pic:cNvPicPr/>
+                  </pic:nvPicPr>
+                  <pic:blipFill>
+                    <a:blip r:embed="rId25"/>
+                    <a:stretch>
+                      <a:fillRect/>
+                    </a:stretch>
+                  </pic:blipFill>
+                  <pic:spPr>
+                    <a:xfrm>
+                      <a:off x="0" y="0"/>
+                      <a:ext cx="5737489" cy="3134218"/>
+                    </a:xfrm>
+                    <a:prstGeom prst="rect">
+                      <a:avLst/>
+                    </a:prstGeom>
+                  </pic:spPr>
+                </pic:pic>
+              </a:graphicData>
+            </a:graphic>
+          </wp:inline>
+        </w:drawing>
+      </w:r>
+    </w:p>
+    <w:p>
+      <w:r>
+        <w:t>Q22) Insert the following records into Issue table:</w:t>
+      </w:r>
+    </w:p>
+    <w:p>
+      <w:r>
+        <w:drawing>
+          <wp:inline distT="0" distB="0" distL="0" distR="0" wp14:anchorId="3F974DDF" wp14:editId="57C748E5">
+            <wp:extent cx="5731510" cy="2106930"/>
+            <wp:effectExtent l="0" t="0" r="2540" b="7620"/>
+            <wp:docPr id="23" name="Picture 23"/>
+            <wp:cNvGraphicFramePr>
+              <a:graphicFrameLocks xmlns:a="http://schemas.openxmlformats.org/drawingml/2006/main" noChangeAspect="1"/>
+            </wp:cNvGraphicFramePr>
+            <a:graphic xmlns:a="http://schemas.openxmlformats.org/drawingml/2006/main">
+              <a:graphicData uri="http://schemas.openxmlformats.org/drawingml/2006/picture">
+                <pic:pic xmlns:pic="http://schemas.openxmlformats.org/drawingml/2006/picture">
+                  <pic:nvPicPr>
+                    <pic:cNvPr id="1" name=""/>
+                    <pic:cNvPicPr/>
+                  </pic:nvPicPr>
+                  <pic:blipFill>
+                    <a:blip r:embed="rId26"/>
+                    <a:stretch>
+                      <a:fillRect/>
+                    </a:stretch>
+                  </pic:blipFill>
+                  <pic:spPr>
+                    <a:xfrm>
+                      <a:off x="0" y="0"/>
+                      <a:ext cx="5731510" cy="2106930"/>
+                    </a:xfrm>
+                    <a:prstGeom prst="rect">
+                      <a:avLst/>
+                    </a:prstGeom>
+                  </pic:spPr>
+                </pic:pic>
+              </a:graphicData>
+            </a:graphic>
+          </wp:inline>
+        </w:drawing>
       </w:r>
       <w:bookmarkStart w:id="0" w:name="_GoBack"/>
       <w:bookmarkEnd w:id="0"/>

</xml_diff>